<commit_message>
network is working!!! yay! :)
</commit_message>
<xml_diff>
--- a/networkx notes.docx
+++ b/networkx notes.docx
@@ -16,19 +16,19 @@
         <w:rPr>
           <w:rStyle w:val="Hyperlink"/>
         </w:rPr>
-        <w:t>https://www.kaggle.com/code/alireza151/n</w:t>
+        <w:t>https://www.kaggle.com/c</w:t>
       </w:r>
       <w:r>
         <w:rPr>
           <w:rStyle w:val="Hyperlink"/>
         </w:rPr>
-        <w:t>e</w:t>
+        <w:t>o</w:t>
       </w:r>
       <w:r>
         <w:rPr>
           <w:rStyle w:val="Hyperlink"/>
         </w:rPr>
-        <w:t>tworkx-tutorial</w:t>
+        <w:t>de/alireza151/networkx-tutorial</w:t>
       </w:r>
       <w:r>
         <w:fldChar w:fldCharType="end"/>
@@ -425,12 +425,6 @@
     <w:p/>
     <w:p>
       <w:r>
-        <w:t>#step 6: show the plot</w:t>
-      </w:r>
-    </w:p>
-    <w:p/>
-    <w:p>
-      <w:r>
         <w:t xml:space="preserve">Methods: </w:t>
       </w:r>
     </w:p>
@@ -549,10 +543,7 @@
         <w:t>"</w:t>
       </w:r>
       <w:r>
-        <w:t>]</w:t>
-      </w:r>
-      <w:r>
-        <w:t>[</w:t>
+        <w:t>][</w:t>
       </w:r>
       <w:proofErr w:type="gramEnd"/>
       <w:r>
@@ -763,24 +754,6 @@
     <w:p>
       <w:proofErr w:type="spellStart"/>
       <w:r>
-        <w:t>Networkx</w:t>
-      </w:r>
-      <w:proofErr w:type="spellEnd"/>
-      <w:r>
-        <w:t xml:space="preserve"> doesn’t directly read excel, so we </w:t>
-      </w:r>
-      <w:proofErr w:type="gramStart"/>
-      <w:r>
-        <w:t>have to</w:t>
-      </w:r>
-      <w:proofErr w:type="gramEnd"/>
-      <w:r>
-        <w:t xml:space="preserve"> open the file with pandas: </w:t>
-      </w:r>
-    </w:p>
-    <w:p>
-      <w:proofErr w:type="spellStart"/>
-      <w:r>
         <w:t>df</w:t>
       </w:r>
       <w:proofErr w:type="spellEnd"/>
@@ -794,7 +767,10 @@
       </w:r>
       <w:proofErr w:type="gramEnd"/>
       <w:r>
-        <w:t>_excel</w:t>
+        <w:t>_</w:t>
+      </w:r>
+      <w:r>
+        <w:t>csv</w:t>
       </w:r>
       <w:proofErr w:type="spellEnd"/>
       <w:r>
@@ -936,7 +912,6 @@
     </w:p>
     <w:p>
       <w:r>
-        <w:lastRenderedPageBreak/>
         <w:t xml:space="preserve">There’s more information on the link on how to read </w:t>
       </w:r>
       <w:r>
@@ -2073,6 +2048,7 @@
   <w:style w:type="character" w:default="1" w:styleId="DefaultParagraphFont">
     <w:name w:val="Default Paragraph Font"/>
     <w:uiPriority w:val="1"/>
+    <w:semiHidden/>
     <w:unhideWhenUsed/>
   </w:style>
   <w:style w:type="table" w:default="1" w:styleId="TableNormal">

</xml_diff>